<commit_message>
auto(daily): dev loop report 2026-06-15
</commit_message>
<xml_diff>
--- a/reports/hypothesis/2026-06-15.docx
+++ b/reports/hypothesis/2026-06-15.docx
@@ -15,7 +15,7 @@
         <w:rPr>
           <w:i/>
         </w:rPr>
-        <w:t>생성일: 2026-06-15 09:15 KST  |  표본: 측정소당 최소 2508건 / 총 12715건</w:t>
+        <w:t>생성일: 2026-06-15 14:26 KST  |  표본: 측정소당 최소 2514건 / 총 12745건</w:t>
       </w:r>
     </w:p>
     <w:p>
@@ -143,7 +143,7 @@
           </w:tcPr>
           <w:p>
             <w:r>
-              <w:t>36.470</w:t>
+              <w:t>36.447</w:t>
             </w:r>
           </w:p>
         </w:tc>
@@ -153,7 +153,7 @@
           </w:tcPr>
           <w:p>
             <w:r>
-              <w:t>33.426</w:t>
+              <w:t>33.408</w:t>
             </w:r>
           </w:p>
         </w:tc>
@@ -163,7 +163,7 @@
           </w:tcPr>
           <w:p>
             <w:r>
-              <w:t>+3.045</w:t>
+              <w:t>+3.038</w:t>
             </w:r>
           </w:p>
         </w:tc>
@@ -215,7 +215,7 @@
           </w:tcPr>
           <w:p>
             <w:r>
-              <w:t>20.391</w:t>
+              <w:t>20.383</w:t>
             </w:r>
           </w:p>
         </w:tc>
@@ -225,7 +225,7 @@
           </w:tcPr>
           <w:p>
             <w:r>
-              <w:t>17.520</w:t>
+              <w:t>17.517</w:t>
             </w:r>
           </w:p>
         </w:tc>
@@ -235,7 +235,7 @@
           </w:tcPr>
           <w:p>
             <w:r>
-              <w:t>+2.871</w:t>
+              <w:t>+2.866</w:t>
             </w:r>
           </w:p>
         </w:tc>
@@ -660,7 +660,7 @@
           </w:tcPr>
           <w:p>
             <w:r>
-              <w:t>32.18</w:t>
+              <w:t>32.15</w:t>
             </w:r>
           </w:p>
         </w:tc>
@@ -722,7 +722,7 @@
           </w:tcPr>
           <w:p>
             <w:r>
-              <w:t>80.12</w:t>
+              <w:t>80.46</w:t>
             </w:r>
           </w:p>
         </w:tc>
@@ -784,7 +784,7 @@
           </w:tcPr>
           <w:p>
             <w:r>
-              <w:t>12.50</w:t>
+              <w:t>12.69</w:t>
             </w:r>
           </w:p>
         </w:tc>
@@ -846,7 +846,7 @@
           </w:tcPr>
           <w:p>
             <w:r>
-              <w:t>164.12</w:t>
+              <w:t>164.18</w:t>
             </w:r>
           </w:p>
         </w:tc>
@@ -908,7 +908,7 @@
           </w:tcPr>
           <w:p>
             <w:r>
-              <w:t>65.47</w:t>
+              <w:t>65.37</w:t>
             </w:r>
           </w:p>
         </w:tc>
@@ -970,7 +970,7 @@
           </w:tcPr>
           <w:p>
             <w:r>
-              <w:t>145.76</w:t>
+              <w:t>145.84</w:t>
             </w:r>
           </w:p>
         </w:tc>

</xml_diff>